<commit_message>
add BaoCao, PhanCong, DongGop
</commit_message>
<xml_diff>
--- a/BaoCaoBTL.docx
+++ b/BaoCaoBTL.docx
@@ -18612,6 +18612,7 @@
     <w:p>
       <w:pPr>
         <w:numPr>
+          <w:ilvl w:val="0"/>
           <w:numId w:val="0"/>
         </w:numPr>
         <w:bidi w:val="0"/>
@@ -18626,6 +18627,7 @@
     <w:p>
       <w:pPr>
         <w:numPr>
+          <w:ilvl w:val="0"/>
           <w:numId w:val="0"/>
         </w:numPr>
         <w:bidi w:val="0"/>
@@ -18640,6 +18642,7 @@
     <w:p>
       <w:pPr>
         <w:numPr>
+          <w:ilvl w:val="0"/>
           <w:numId w:val="0"/>
         </w:numPr>
         <w:bidi w:val="0"/>
@@ -18654,6 +18657,7 @@
     <w:p>
       <w:pPr>
         <w:numPr>
+          <w:ilvl w:val="0"/>
           <w:numId w:val="0"/>
         </w:numPr>
         <w:bidi w:val="0"/>
@@ -18668,6 +18672,7 @@
     <w:p>
       <w:pPr>
         <w:numPr>
+          <w:ilvl w:val="0"/>
           <w:numId w:val="0"/>
         </w:numPr>
         <w:bidi w:val="0"/>
@@ -18682,6 +18687,7 @@
     <w:p>
       <w:pPr>
         <w:numPr>
+          <w:ilvl w:val="0"/>
           <w:numId w:val="0"/>
         </w:numPr>
         <w:bidi w:val="0"/>
@@ -18696,6 +18702,7 @@
     <w:p>
       <w:pPr>
         <w:numPr>
+          <w:ilvl w:val="0"/>
           <w:numId w:val="0"/>
         </w:numPr>
         <w:bidi w:val="0"/>
@@ -18710,6 +18717,7 @@
     <w:p>
       <w:pPr>
         <w:numPr>
+          <w:ilvl w:val="0"/>
           <w:numId w:val="0"/>
         </w:numPr>
         <w:bidi w:val="0"/>
@@ -18724,6 +18732,7 @@
     <w:p>
       <w:pPr>
         <w:numPr>
+          <w:ilvl w:val="0"/>
           <w:numId w:val="0"/>
         </w:numPr>
         <w:bidi w:val="0"/>
@@ -18738,6 +18747,7 @@
     <w:p>
       <w:pPr>
         <w:numPr>
+          <w:ilvl w:val="0"/>
           <w:numId w:val="0"/>
         </w:numPr>
         <w:bidi w:val="0"/>
@@ -18752,6 +18762,7 @@
     <w:p>
       <w:pPr>
         <w:numPr>
+          <w:ilvl w:val="0"/>
           <w:numId w:val="0"/>
         </w:numPr>
         <w:bidi w:val="0"/>
@@ -18766,6 +18777,7 @@
     <w:p>
       <w:pPr>
         <w:numPr>
+          <w:ilvl w:val="0"/>
           <w:numId w:val="0"/>
         </w:numPr>
         <w:bidi w:val="0"/>
@@ -18780,6 +18792,7 @@
     <w:p>
       <w:pPr>
         <w:numPr>
+          <w:ilvl w:val="0"/>
           <w:numId w:val="0"/>
         </w:numPr>
         <w:bidi w:val="0"/>
@@ -18794,6 +18807,7 @@
     <w:p>
       <w:pPr>
         <w:numPr>
+          <w:ilvl w:val="0"/>
           <w:numId w:val="0"/>
         </w:numPr>
         <w:bidi w:val="0"/>
@@ -18808,6 +18822,7 @@
     <w:p>
       <w:pPr>
         <w:numPr>
+          <w:ilvl w:val="0"/>
           <w:numId w:val="0"/>
         </w:numPr>
         <w:bidi w:val="0"/>
@@ -18822,6 +18837,7 @@
     <w:p>
       <w:pPr>
         <w:numPr>
+          <w:ilvl w:val="0"/>
           <w:numId w:val="0"/>
         </w:numPr>
         <w:bidi w:val="0"/>
@@ -18836,6 +18852,7 @@
     <w:p>
       <w:pPr>
         <w:numPr>
+          <w:ilvl w:val="0"/>
           <w:numId w:val="0"/>
         </w:numPr>
         <w:bidi w:val="0"/>
@@ -18850,6 +18867,7 @@
     <w:p>
       <w:pPr>
         <w:numPr>
+          <w:ilvl w:val="0"/>
           <w:numId w:val="0"/>
         </w:numPr>
         <w:bidi w:val="0"/>
@@ -18864,6 +18882,7 @@
     <w:p>
       <w:pPr>
         <w:numPr>
+          <w:ilvl w:val="0"/>
           <w:numId w:val="0"/>
         </w:numPr>
         <w:bidi w:val="0"/>
@@ -18878,6 +18897,7 @@
     <w:p>
       <w:pPr>
         <w:numPr>
+          <w:ilvl w:val="0"/>
           <w:numId w:val="0"/>
         </w:numPr>
         <w:bidi w:val="0"/>
@@ -18893,6 +18913,7 @@
     <w:p>
       <w:pPr>
         <w:numPr>
+          <w:ilvl w:val="0"/>
           <w:numId w:val="0"/>
         </w:numPr>
         <w:bidi w:val="0"/>
@@ -20752,9 +20773,806 @@
         </w:tc>
       </w:tr>
     </w:tbl>
+    <w:tbl>
+      <w:tblPr>
+        <w:tblStyle w:val="18"/>
+        <w:tblpPr w:leftFromText="180" w:rightFromText="180" w:vertAnchor="page" w:horzAnchor="page" w:tblpX="1157" w:tblpY="13000"/>
+        <w:tblOverlap w:val="never"/>
+        <w:tblW w:w="9865" w:type="dxa"/>
+        <w:tblInd w:w="0" w:type="dxa"/>
+        <w:tblBorders>
+          <w:top w:val="single" w:color="auto" w:sz="4" w:space="0"/>
+          <w:left w:val="single" w:color="auto" w:sz="4" w:space="0"/>
+          <w:bottom w:val="single" w:color="auto" w:sz="4" w:space="0"/>
+          <w:right w:val="single" w:color="auto" w:sz="4" w:space="0"/>
+          <w:insideH w:val="single" w:color="auto" w:sz="4" w:space="0"/>
+          <w:insideV w:val="single" w:color="auto" w:sz="4" w:space="0"/>
+        </w:tblBorders>
+        <w:tblLayout w:type="fixed"/>
+        <w:tblCellMar>
+          <w:top w:w="0" w:type="dxa"/>
+          <w:left w:w="108" w:type="dxa"/>
+          <w:bottom w:w="0" w:type="dxa"/>
+          <w:right w:w="108" w:type="dxa"/>
+        </w:tblCellMar>
+      </w:tblPr>
+      <w:tblGrid>
+        <w:gridCol w:w="656"/>
+        <w:gridCol w:w="3121"/>
+        <w:gridCol w:w="4005"/>
+        <w:gridCol w:w="2083"/>
+      </w:tblGrid>
+      <w:tr>
+        <w:tblPrEx>
+          <w:tblBorders>
+            <w:top w:val="single" w:color="auto" w:sz="4" w:space="0"/>
+            <w:left w:val="single" w:color="auto" w:sz="4" w:space="0"/>
+            <w:bottom w:val="single" w:color="auto" w:sz="4" w:space="0"/>
+            <w:right w:val="single" w:color="auto" w:sz="4" w:space="0"/>
+            <w:insideH w:val="single" w:color="auto" w:sz="4" w:space="0"/>
+            <w:insideV w:val="single" w:color="auto" w:sz="4" w:space="0"/>
+          </w:tblBorders>
+          <w:tblCellMar>
+            <w:top w:w="0" w:type="dxa"/>
+            <w:left w:w="108" w:type="dxa"/>
+            <w:bottom w:w="0" w:type="dxa"/>
+            <w:right w:w="108" w:type="dxa"/>
+          </w:tblCellMar>
+        </w:tblPrEx>
+        <w:tc>
+          <w:tcPr>
+            <w:tcW w:w="656" w:type="dxa"/>
+            <w:vAlign w:val="center"/>
+          </w:tcPr>
+          <w:p>
+            <w:pPr>
+              <w:jc w:val="center"/>
+              <w:rPr>
+                <w:rFonts w:hint="default" w:ascii="Times New Roman" w:hAnsi="Times New Roman" w:cs="Times New Roman"/>
+                <w:b w:val="0"/>
+                <w:bCs w:val="0"/>
+                <w:color w:val="auto"/>
+                <w:sz w:val="22"/>
+                <w:szCs w:val="22"/>
+                <w:shd w:val="clear" w:color="auto" w:fill="auto"/>
+                <w:vertAlign w:val="baseline"/>
+                <w:lang w:val="vi-VN"/>
+              </w:rPr>
+            </w:pPr>
+          </w:p>
+          <w:p>
+            <w:pPr>
+              <w:jc w:val="center"/>
+              <w:rPr>
+                <w:rFonts w:hint="default" w:ascii="Times New Roman" w:hAnsi="Times New Roman" w:cs="Times New Roman"/>
+                <w:b w:val="0"/>
+                <w:bCs w:val="0"/>
+                <w:color w:val="auto"/>
+                <w:sz w:val="22"/>
+                <w:szCs w:val="22"/>
+                <w:shd w:val="clear" w:color="auto" w:fill="auto"/>
+                <w:vertAlign w:val="baseline"/>
+                <w:lang w:val="vi-VN"/>
+              </w:rPr>
+            </w:pPr>
+            <w:r>
+              <w:rPr>
+                <w:rFonts w:hint="default" w:ascii="Times New Roman" w:hAnsi="Times New Roman" w:cs="Times New Roman"/>
+                <w:b w:val="0"/>
+                <w:bCs w:val="0"/>
+                <w:color w:val="auto"/>
+                <w:sz w:val="22"/>
+                <w:szCs w:val="22"/>
+                <w:shd w:val="clear" w:color="auto" w:fill="auto"/>
+                <w:vertAlign w:val="baseline"/>
+                <w:lang w:val="vi-VN"/>
+              </w:rPr>
+              <w:t>STT</w:t>
+            </w:r>
+          </w:p>
+        </w:tc>
+        <w:tc>
+          <w:tcPr>
+            <w:tcW w:w="3121" w:type="dxa"/>
+            <w:vAlign w:val="center"/>
+          </w:tcPr>
+          <w:p>
+            <w:pPr>
+              <w:jc w:val="center"/>
+              <w:rPr>
+                <w:rFonts w:hint="default" w:ascii="Times New Roman" w:hAnsi="Times New Roman" w:cs="Times New Roman"/>
+                <w:b w:val="0"/>
+                <w:bCs w:val="0"/>
+                <w:color w:val="auto"/>
+                <w:sz w:val="22"/>
+                <w:szCs w:val="22"/>
+                <w:shd w:val="clear" w:color="auto" w:fill="auto"/>
+                <w:vertAlign w:val="baseline"/>
+                <w:lang w:val="vi-VN"/>
+              </w:rPr>
+            </w:pPr>
+            <w:r>
+              <w:rPr>
+                <w:rFonts w:hint="default" w:ascii="Times New Roman" w:hAnsi="Times New Roman" w:cs="Times New Roman"/>
+                <w:b w:val="0"/>
+                <w:bCs w:val="0"/>
+                <w:color w:val="auto"/>
+                <w:sz w:val="22"/>
+                <w:szCs w:val="22"/>
+                <w:shd w:val="clear" w:color="auto" w:fill="auto"/>
+                <w:vertAlign w:val="baseline"/>
+                <w:lang w:val="vi-VN"/>
+              </w:rPr>
+              <w:t>THÀNH VIÊN</w:t>
+            </w:r>
+          </w:p>
+        </w:tc>
+        <w:tc>
+          <w:tcPr>
+            <w:tcW w:w="4005" w:type="dxa"/>
+            <w:vAlign w:val="center"/>
+          </w:tcPr>
+          <w:p>
+            <w:pPr>
+              <w:jc w:val="center"/>
+              <w:rPr>
+                <w:rFonts w:hint="default" w:ascii="Times New Roman" w:hAnsi="Times New Roman" w:cs="Times New Roman"/>
+                <w:b w:val="0"/>
+                <w:bCs w:val="0"/>
+                <w:color w:val="auto"/>
+                <w:sz w:val="22"/>
+                <w:szCs w:val="22"/>
+                <w:shd w:val="clear" w:color="auto" w:fill="auto"/>
+                <w:vertAlign w:val="baseline"/>
+                <w:lang w:val="vi-VN"/>
+              </w:rPr>
+            </w:pPr>
+            <w:r>
+              <w:rPr>
+                <w:rFonts w:hint="default" w:cs="Times New Roman"/>
+                <w:b w:val="0"/>
+                <w:bCs w:val="0"/>
+                <w:color w:val="auto"/>
+                <w:sz w:val="22"/>
+                <w:szCs w:val="22"/>
+                <w:shd w:val="clear" w:color="auto" w:fill="auto"/>
+                <w:vertAlign w:val="baseline"/>
+                <w:lang w:val="vi-VN"/>
+              </w:rPr>
+              <w:t>MỨC ĐỘ HOÀN THÀNH CÔNG VIỆC</w:t>
+            </w:r>
+          </w:p>
+        </w:tc>
+        <w:tc>
+          <w:tcPr>
+            <w:tcW w:w="2083" w:type="dxa"/>
+            <w:vAlign w:val="center"/>
+          </w:tcPr>
+          <w:p>
+            <w:pPr>
+              <w:jc w:val="center"/>
+              <w:rPr>
+                <w:rFonts w:hint="default" w:ascii="Times New Roman" w:hAnsi="Times New Roman" w:cs="Times New Roman"/>
+                <w:b w:val="0"/>
+                <w:bCs w:val="0"/>
+                <w:color w:val="auto"/>
+                <w:sz w:val="22"/>
+                <w:szCs w:val="22"/>
+                <w:shd w:val="clear" w:color="auto" w:fill="auto"/>
+                <w:vertAlign w:val="baseline"/>
+                <w:lang w:val="vi-VN"/>
+              </w:rPr>
+            </w:pPr>
+            <w:r>
+              <w:rPr>
+                <w:rFonts w:hint="default" w:ascii="Times New Roman" w:hAnsi="Times New Roman" w:cs="Times New Roman"/>
+                <w:b w:val="0"/>
+                <w:bCs w:val="0"/>
+                <w:color w:val="auto"/>
+                <w:sz w:val="22"/>
+                <w:szCs w:val="22"/>
+                <w:shd w:val="clear" w:color="auto" w:fill="auto"/>
+                <w:vertAlign w:val="baseline"/>
+                <w:lang w:val="vi-VN"/>
+              </w:rPr>
+              <w:t>ĐÓNG GÓP</w:t>
+            </w:r>
+          </w:p>
+        </w:tc>
+      </w:tr>
+      <w:tr>
+        <w:tblPrEx>
+          <w:tblBorders>
+            <w:top w:val="single" w:color="auto" w:sz="4" w:space="0"/>
+            <w:left w:val="single" w:color="auto" w:sz="4" w:space="0"/>
+            <w:bottom w:val="single" w:color="auto" w:sz="4" w:space="0"/>
+            <w:right w:val="single" w:color="auto" w:sz="4" w:space="0"/>
+            <w:insideH w:val="single" w:color="auto" w:sz="4" w:space="0"/>
+            <w:insideV w:val="single" w:color="auto" w:sz="4" w:space="0"/>
+          </w:tblBorders>
+          <w:tblCellMar>
+            <w:top w:w="0" w:type="dxa"/>
+            <w:left w:w="108" w:type="dxa"/>
+            <w:bottom w:w="0" w:type="dxa"/>
+            <w:right w:w="108" w:type="dxa"/>
+          </w:tblCellMar>
+        </w:tblPrEx>
+        <w:tc>
+          <w:tcPr>
+            <w:tcW w:w="656" w:type="dxa"/>
+            <w:vAlign w:val="center"/>
+          </w:tcPr>
+          <w:p>
+            <w:pPr>
+              <w:jc w:val="center"/>
+              <w:rPr>
+                <w:rFonts w:hint="default" w:ascii="Times New Roman" w:hAnsi="Times New Roman" w:cs="Times New Roman"/>
+                <w:b w:val="0"/>
+                <w:bCs w:val="0"/>
+                <w:color w:val="auto"/>
+                <w:sz w:val="22"/>
+                <w:szCs w:val="22"/>
+                <w:shd w:val="clear" w:color="auto" w:fill="auto"/>
+                <w:vertAlign w:val="baseline"/>
+                <w:lang w:val="vi-VN"/>
+              </w:rPr>
+            </w:pPr>
+            <w:r>
+              <w:rPr>
+                <w:rFonts w:hint="default" w:ascii="Times New Roman" w:hAnsi="Times New Roman" w:cs="Times New Roman"/>
+                <w:b w:val="0"/>
+                <w:bCs w:val="0"/>
+                <w:color w:val="auto"/>
+                <w:sz w:val="22"/>
+                <w:szCs w:val="22"/>
+                <w:shd w:val="clear" w:color="auto" w:fill="auto"/>
+                <w:vertAlign w:val="baseline"/>
+                <w:lang w:val="vi-VN"/>
+              </w:rPr>
+              <w:t>1</w:t>
+            </w:r>
+          </w:p>
+        </w:tc>
+        <w:tc>
+          <w:tcPr>
+            <w:tcW w:w="3121" w:type="dxa"/>
+            <w:vAlign w:val="center"/>
+          </w:tcPr>
+          <w:p>
+            <w:pPr>
+              <w:jc w:val="left"/>
+              <w:rPr>
+                <w:rFonts w:hint="default" w:ascii="Times New Roman" w:hAnsi="Times New Roman" w:cs="Times New Roman"/>
+                <w:b w:val="0"/>
+                <w:bCs w:val="0"/>
+                <w:color w:val="auto"/>
+                <w:sz w:val="22"/>
+                <w:szCs w:val="22"/>
+                <w:shd w:val="clear" w:color="auto" w:fill="auto"/>
+                <w:vertAlign w:val="baseline"/>
+                <w:lang w:val="vi-VN"/>
+              </w:rPr>
+            </w:pPr>
+            <w:r>
+              <w:rPr>
+                <w:rFonts w:hint="default" w:ascii="Times New Roman" w:hAnsi="Times New Roman" w:cs="Times New Roman"/>
+                <w:b w:val="0"/>
+                <w:bCs w:val="0"/>
+                <w:color w:val="auto"/>
+                <w:sz w:val="22"/>
+                <w:szCs w:val="22"/>
+                <w:shd w:val="clear" w:color="auto" w:fill="auto"/>
+                <w:vertAlign w:val="baseline"/>
+                <w:lang w:val="vi-VN"/>
+              </w:rPr>
+              <w:t xml:space="preserve">Kiều Thị Thu Trang - 24100093 </w:t>
+            </w:r>
+          </w:p>
+          <w:p>
+            <w:pPr>
+              <w:jc w:val="left"/>
+              <w:rPr>
+                <w:rFonts w:hint="default" w:ascii="Times New Roman" w:hAnsi="Times New Roman" w:cs="Times New Roman"/>
+                <w:b w:val="0"/>
+                <w:bCs w:val="0"/>
+                <w:color w:val="auto"/>
+                <w:sz w:val="22"/>
+                <w:szCs w:val="22"/>
+                <w:shd w:val="clear" w:color="auto" w:fill="auto"/>
+                <w:vertAlign w:val="baseline"/>
+                <w:lang w:val="vi-VN"/>
+              </w:rPr>
+            </w:pPr>
+            <w:r>
+              <w:rPr>
+                <w:rFonts w:hint="default" w:ascii="Times New Roman" w:hAnsi="Times New Roman" w:cs="Times New Roman"/>
+                <w:b w:val="0"/>
+                <w:bCs w:val="0"/>
+                <w:color w:val="auto"/>
+                <w:sz w:val="22"/>
+                <w:szCs w:val="22"/>
+                <w:shd w:val="clear" w:color="auto" w:fill="auto"/>
+                <w:vertAlign w:val="baseline"/>
+                <w:lang w:val="vi-VN"/>
+              </w:rPr>
+              <w:t>(Trưởng nhóm)</w:t>
+            </w:r>
+          </w:p>
+        </w:tc>
+        <w:tc>
+          <w:tcPr>
+            <w:tcW w:w="4005" w:type="dxa"/>
+            <w:vAlign w:val="center"/>
+          </w:tcPr>
+          <w:p>
+            <w:pPr>
+              <w:jc w:val="center"/>
+              <w:rPr>
+                <w:rFonts w:hint="default" w:ascii="Times New Roman" w:hAnsi="Times New Roman"/>
+                <w:b w:val="0"/>
+                <w:bCs w:val="0"/>
+                <w:color w:val="auto"/>
+                <w:sz w:val="22"/>
+                <w:szCs w:val="22"/>
+                <w:shd w:val="clear" w:color="auto" w:fill="auto"/>
+                <w:vertAlign w:val="baseline"/>
+                <w:lang w:val="vi-VN"/>
+              </w:rPr>
+            </w:pPr>
+            <w:r>
+              <w:rPr>
+                <w:rFonts w:hint="default"/>
+                <w:b w:val="0"/>
+                <w:bCs w:val="0"/>
+                <w:color w:val="auto"/>
+                <w:sz w:val="22"/>
+                <w:szCs w:val="22"/>
+                <w:shd w:val="clear" w:color="auto" w:fill="auto"/>
+                <w:vertAlign w:val="baseline"/>
+                <w:lang w:val="vi-VN"/>
+              </w:rPr>
+              <w:t>100%</w:t>
+            </w:r>
+          </w:p>
+        </w:tc>
+        <w:tc>
+          <w:tcPr>
+            <w:tcW w:w="2083" w:type="dxa"/>
+            <w:vAlign w:val="center"/>
+          </w:tcPr>
+          <w:p>
+            <w:pPr>
+              <w:jc w:val="center"/>
+              <w:rPr>
+                <w:rFonts w:hint="default" w:ascii="Times New Roman" w:hAnsi="Times New Roman" w:cs="Times New Roman"/>
+                <w:b w:val="0"/>
+                <w:bCs w:val="0"/>
+                <w:color w:val="auto"/>
+                <w:sz w:val="22"/>
+                <w:szCs w:val="22"/>
+                <w:shd w:val="clear" w:color="auto" w:fill="auto"/>
+                <w:vertAlign w:val="baseline"/>
+                <w:lang w:val="vi-VN"/>
+              </w:rPr>
+            </w:pPr>
+            <w:r>
+              <w:rPr>
+                <w:rFonts w:hint="default" w:ascii="Times New Roman" w:hAnsi="Times New Roman" w:cs="Times New Roman"/>
+                <w:b w:val="0"/>
+                <w:bCs w:val="0"/>
+                <w:color w:val="auto"/>
+                <w:sz w:val="22"/>
+                <w:szCs w:val="22"/>
+                <w:shd w:val="clear" w:color="auto" w:fill="auto"/>
+                <w:vertAlign w:val="baseline"/>
+                <w:lang w:val="vi-VN"/>
+              </w:rPr>
+              <w:t>50%</w:t>
+            </w:r>
+          </w:p>
+        </w:tc>
+      </w:tr>
+      <w:tr>
+        <w:tblPrEx>
+          <w:tblBorders>
+            <w:top w:val="single" w:color="auto" w:sz="4" w:space="0"/>
+            <w:left w:val="single" w:color="auto" w:sz="4" w:space="0"/>
+            <w:bottom w:val="single" w:color="auto" w:sz="4" w:space="0"/>
+            <w:right w:val="single" w:color="auto" w:sz="4" w:space="0"/>
+            <w:insideH w:val="single" w:color="auto" w:sz="4" w:space="0"/>
+            <w:insideV w:val="single" w:color="auto" w:sz="4" w:space="0"/>
+          </w:tblBorders>
+          <w:tblCellMar>
+            <w:top w:w="0" w:type="dxa"/>
+            <w:left w:w="108" w:type="dxa"/>
+            <w:bottom w:w="0" w:type="dxa"/>
+            <w:right w:w="108" w:type="dxa"/>
+          </w:tblCellMar>
+        </w:tblPrEx>
+        <w:tc>
+          <w:tcPr>
+            <w:tcW w:w="656" w:type="dxa"/>
+            <w:vAlign w:val="center"/>
+          </w:tcPr>
+          <w:p>
+            <w:pPr>
+              <w:jc w:val="center"/>
+              <w:rPr>
+                <w:rFonts w:hint="default" w:ascii="Times New Roman" w:hAnsi="Times New Roman" w:cs="Times New Roman"/>
+                <w:b w:val="0"/>
+                <w:bCs w:val="0"/>
+                <w:color w:val="auto"/>
+                <w:sz w:val="22"/>
+                <w:szCs w:val="22"/>
+                <w:shd w:val="clear" w:color="auto" w:fill="auto"/>
+                <w:vertAlign w:val="baseline"/>
+                <w:lang w:val="vi-VN"/>
+              </w:rPr>
+            </w:pPr>
+            <w:r>
+              <w:rPr>
+                <w:rFonts w:hint="default" w:ascii="Times New Roman" w:hAnsi="Times New Roman" w:cs="Times New Roman"/>
+                <w:b w:val="0"/>
+                <w:bCs w:val="0"/>
+                <w:color w:val="auto"/>
+                <w:sz w:val="22"/>
+                <w:szCs w:val="22"/>
+                <w:shd w:val="clear" w:color="auto" w:fill="auto"/>
+                <w:vertAlign w:val="baseline"/>
+                <w:lang w:val="vi-VN"/>
+              </w:rPr>
+              <w:t>2</w:t>
+            </w:r>
+          </w:p>
+        </w:tc>
+        <w:tc>
+          <w:tcPr>
+            <w:tcW w:w="3121" w:type="dxa"/>
+            <w:vAlign w:val="center"/>
+          </w:tcPr>
+          <w:p>
+            <w:pPr>
+              <w:jc w:val="left"/>
+              <w:rPr>
+                <w:rFonts w:hint="default" w:ascii="Times New Roman" w:hAnsi="Times New Roman" w:cs="Times New Roman"/>
+                <w:b w:val="0"/>
+                <w:bCs w:val="0"/>
+                <w:color w:val="auto"/>
+                <w:sz w:val="22"/>
+                <w:szCs w:val="22"/>
+                <w:shd w:val="clear" w:color="auto" w:fill="auto"/>
+                <w:vertAlign w:val="baseline"/>
+                <w:lang w:val="vi-VN"/>
+              </w:rPr>
+            </w:pPr>
+            <w:r>
+              <w:rPr>
+                <w:rFonts w:hint="default" w:ascii="Times New Roman" w:hAnsi="Times New Roman" w:cs="Times New Roman"/>
+                <w:b w:val="0"/>
+                <w:bCs w:val="0"/>
+                <w:color w:val="auto"/>
+                <w:sz w:val="22"/>
+                <w:szCs w:val="22"/>
+                <w:shd w:val="clear" w:color="auto" w:fill="auto"/>
+                <w:vertAlign w:val="baseline"/>
+                <w:lang w:val="vi-VN"/>
+              </w:rPr>
+              <w:t>Trần Minh Sang - 24100012</w:t>
+            </w:r>
+          </w:p>
+          <w:p>
+            <w:pPr>
+              <w:jc w:val="left"/>
+              <w:rPr>
+                <w:rFonts w:hint="default" w:ascii="Times New Roman" w:hAnsi="Times New Roman" w:cs="Times New Roman"/>
+                <w:b w:val="0"/>
+                <w:bCs w:val="0"/>
+                <w:color w:val="auto"/>
+                <w:sz w:val="22"/>
+                <w:szCs w:val="22"/>
+                <w:shd w:val="clear" w:color="auto" w:fill="auto"/>
+                <w:vertAlign w:val="baseline"/>
+                <w:lang w:val="vi-VN"/>
+              </w:rPr>
+            </w:pPr>
+            <w:r>
+              <w:rPr>
+                <w:rFonts w:hint="default" w:ascii="Times New Roman" w:hAnsi="Times New Roman" w:cs="Times New Roman"/>
+                <w:b w:val="0"/>
+                <w:bCs w:val="0"/>
+                <w:color w:val="auto"/>
+                <w:sz w:val="22"/>
+                <w:szCs w:val="22"/>
+                <w:shd w:val="clear" w:color="auto" w:fill="auto"/>
+                <w:vertAlign w:val="baseline"/>
+                <w:lang w:val="vi-VN"/>
+              </w:rPr>
+              <w:t>(Thành viên)</w:t>
+            </w:r>
+          </w:p>
+        </w:tc>
+        <w:tc>
+          <w:tcPr>
+            <w:tcW w:w="4005" w:type="dxa"/>
+            <w:vAlign w:val="center"/>
+          </w:tcPr>
+          <w:p>
+            <w:pPr>
+              <w:jc w:val="center"/>
+              <w:rPr>
+                <w:rFonts w:hint="default" w:ascii="Times New Roman" w:hAnsi="Times New Roman"/>
+                <w:b w:val="0"/>
+                <w:bCs w:val="0"/>
+                <w:color w:val="auto"/>
+                <w:sz w:val="22"/>
+                <w:szCs w:val="22"/>
+                <w:shd w:val="clear" w:color="auto" w:fill="auto"/>
+                <w:vertAlign w:val="baseline"/>
+                <w:lang w:val="vi-VN"/>
+              </w:rPr>
+            </w:pPr>
+            <w:r>
+              <w:rPr>
+                <w:rFonts w:hint="default"/>
+                <w:b w:val="0"/>
+                <w:bCs w:val="0"/>
+                <w:color w:val="auto"/>
+                <w:sz w:val="22"/>
+                <w:szCs w:val="22"/>
+                <w:shd w:val="clear" w:color="auto" w:fill="auto"/>
+                <w:vertAlign w:val="baseline"/>
+                <w:lang w:val="vi-VN"/>
+              </w:rPr>
+              <w:t>100%</w:t>
+            </w:r>
+          </w:p>
+        </w:tc>
+        <w:tc>
+          <w:tcPr>
+            <w:tcW w:w="2083" w:type="dxa"/>
+            <w:vAlign w:val="center"/>
+          </w:tcPr>
+          <w:p>
+            <w:pPr>
+              <w:jc w:val="center"/>
+              <w:rPr>
+                <w:rFonts w:hint="default" w:ascii="Times New Roman" w:hAnsi="Times New Roman" w:cs="Times New Roman"/>
+                <w:b w:val="0"/>
+                <w:bCs w:val="0"/>
+                <w:color w:val="auto"/>
+                <w:sz w:val="22"/>
+                <w:szCs w:val="22"/>
+                <w:shd w:val="clear" w:color="auto" w:fill="auto"/>
+                <w:vertAlign w:val="baseline"/>
+                <w:lang w:val="vi-VN"/>
+              </w:rPr>
+            </w:pPr>
+            <w:r>
+              <w:rPr>
+                <w:rFonts w:hint="default" w:ascii="Times New Roman" w:hAnsi="Times New Roman" w:cs="Times New Roman"/>
+                <w:b w:val="0"/>
+                <w:bCs w:val="0"/>
+                <w:color w:val="auto"/>
+                <w:sz w:val="22"/>
+                <w:szCs w:val="22"/>
+                <w:shd w:val="clear" w:color="auto" w:fill="auto"/>
+                <w:vertAlign w:val="baseline"/>
+                <w:lang w:val="vi-VN"/>
+              </w:rPr>
+              <w:t>25%</w:t>
+            </w:r>
+          </w:p>
+        </w:tc>
+      </w:tr>
+      <w:tr>
+        <w:tblPrEx>
+          <w:tblBorders>
+            <w:top w:val="single" w:color="auto" w:sz="4" w:space="0"/>
+            <w:left w:val="single" w:color="auto" w:sz="4" w:space="0"/>
+            <w:bottom w:val="single" w:color="auto" w:sz="4" w:space="0"/>
+            <w:right w:val="single" w:color="auto" w:sz="4" w:space="0"/>
+            <w:insideH w:val="single" w:color="auto" w:sz="4" w:space="0"/>
+            <w:insideV w:val="single" w:color="auto" w:sz="4" w:space="0"/>
+          </w:tblBorders>
+          <w:tblCellMar>
+            <w:top w:w="0" w:type="dxa"/>
+            <w:left w:w="108" w:type="dxa"/>
+            <w:bottom w:w="0" w:type="dxa"/>
+            <w:right w:w="108" w:type="dxa"/>
+          </w:tblCellMar>
+        </w:tblPrEx>
+        <w:tc>
+          <w:tcPr>
+            <w:tcW w:w="656" w:type="dxa"/>
+            <w:vAlign w:val="center"/>
+          </w:tcPr>
+          <w:p>
+            <w:pPr>
+              <w:jc w:val="center"/>
+              <w:rPr>
+                <w:rFonts w:hint="default" w:ascii="Times New Roman" w:hAnsi="Times New Roman" w:cs="Times New Roman"/>
+                <w:b w:val="0"/>
+                <w:bCs w:val="0"/>
+                <w:color w:val="auto"/>
+                <w:sz w:val="22"/>
+                <w:szCs w:val="22"/>
+                <w:shd w:val="clear" w:color="auto" w:fill="auto"/>
+                <w:vertAlign w:val="baseline"/>
+                <w:lang w:val="vi-VN"/>
+              </w:rPr>
+            </w:pPr>
+            <w:r>
+              <w:rPr>
+                <w:rFonts w:hint="default" w:ascii="Times New Roman" w:hAnsi="Times New Roman" w:cs="Times New Roman"/>
+                <w:b w:val="0"/>
+                <w:bCs w:val="0"/>
+                <w:color w:val="auto"/>
+                <w:sz w:val="22"/>
+                <w:szCs w:val="22"/>
+                <w:shd w:val="clear" w:color="auto" w:fill="auto"/>
+                <w:vertAlign w:val="baseline"/>
+                <w:lang w:val="vi-VN"/>
+              </w:rPr>
+              <w:t>3</w:t>
+            </w:r>
+          </w:p>
+        </w:tc>
+        <w:tc>
+          <w:tcPr>
+            <w:tcW w:w="3121" w:type="dxa"/>
+            <w:vAlign w:val="center"/>
+          </w:tcPr>
+          <w:p>
+            <w:pPr>
+              <w:keepNext w:val="0"/>
+              <w:keepLines w:val="0"/>
+              <w:widowControl/>
+              <w:suppressLineNumbers w:val="0"/>
+              <w:shd w:val="clear" w:fill="FFFFFF"/>
+              <w:spacing w:line="228" w:lineRule="atLeast"/>
+              <w:jc w:val="left"/>
+              <w:rPr>
+                <w:rFonts w:hint="default" w:ascii="Times New Roman" w:hAnsi="Times New Roman" w:cs="Times New Roman"/>
+                <w:b w:val="0"/>
+                <w:bCs w:val="0"/>
+                <w:color w:val="auto"/>
+                <w:sz w:val="22"/>
+                <w:szCs w:val="22"/>
+                <w:shd w:val="clear" w:color="auto" w:fill="auto"/>
+                <w:vertAlign w:val="baseline"/>
+                <w:lang w:val="vi-VN"/>
+              </w:rPr>
+            </w:pPr>
+            <w:r>
+              <w:rPr>
+                <w:rFonts w:hint="default" w:ascii="Times New Roman" w:hAnsi="Times New Roman" w:cs="Times New Roman"/>
+                <w:b w:val="0"/>
+                <w:bCs w:val="0"/>
+                <w:color w:val="auto"/>
+                <w:sz w:val="22"/>
+                <w:szCs w:val="22"/>
+                <w:shd w:val="clear" w:color="auto" w:fill="auto"/>
+                <w:vertAlign w:val="baseline"/>
+                <w:lang w:val="vi-VN"/>
+              </w:rPr>
+              <w:t xml:space="preserve">Ngô Quang Thiện - 24102651 </w:t>
+            </w:r>
+          </w:p>
+          <w:p>
+            <w:pPr>
+              <w:keepNext w:val="0"/>
+              <w:keepLines w:val="0"/>
+              <w:widowControl/>
+              <w:suppressLineNumbers w:val="0"/>
+              <w:shd w:val="clear" w:fill="FFFFFF"/>
+              <w:spacing w:line="228" w:lineRule="atLeast"/>
+              <w:jc w:val="left"/>
+              <w:rPr>
+                <w:rFonts w:hint="default" w:ascii="Times New Roman" w:hAnsi="Times New Roman" w:cs="Times New Roman"/>
+                <w:b w:val="0"/>
+                <w:bCs w:val="0"/>
+                <w:color w:val="auto"/>
+                <w:sz w:val="22"/>
+                <w:szCs w:val="22"/>
+                <w:shd w:val="clear" w:color="auto" w:fill="auto"/>
+                <w:vertAlign w:val="baseline"/>
+                <w:lang w:val="vi-VN"/>
+              </w:rPr>
+            </w:pPr>
+            <w:r>
+              <w:rPr>
+                <w:rFonts w:hint="default" w:ascii="Times New Roman" w:hAnsi="Times New Roman" w:cs="Times New Roman"/>
+                <w:b w:val="0"/>
+                <w:bCs w:val="0"/>
+                <w:color w:val="auto"/>
+                <w:sz w:val="22"/>
+                <w:szCs w:val="22"/>
+                <w:shd w:val="clear" w:color="auto" w:fill="auto"/>
+                <w:vertAlign w:val="baseline"/>
+                <w:lang w:val="vi-VN"/>
+              </w:rPr>
+              <w:t>(Thành viên)</w:t>
+            </w:r>
+          </w:p>
+        </w:tc>
+        <w:tc>
+          <w:tcPr>
+            <w:tcW w:w="4005" w:type="dxa"/>
+            <w:vAlign w:val="center"/>
+          </w:tcPr>
+          <w:p>
+            <w:pPr>
+              <w:jc w:val="center"/>
+              <w:rPr>
+                <w:rFonts w:hint="default" w:ascii="Times New Roman" w:hAnsi="Times New Roman"/>
+                <w:b w:val="0"/>
+                <w:bCs w:val="0"/>
+                <w:color w:val="auto"/>
+                <w:sz w:val="22"/>
+                <w:szCs w:val="22"/>
+                <w:shd w:val="clear" w:color="auto" w:fill="auto"/>
+                <w:vertAlign w:val="baseline"/>
+                <w:lang w:val="vi-VN"/>
+              </w:rPr>
+            </w:pPr>
+            <w:r>
+              <w:rPr>
+                <w:rFonts w:hint="default"/>
+                <w:b w:val="0"/>
+                <w:bCs w:val="0"/>
+                <w:color w:val="auto"/>
+                <w:sz w:val="22"/>
+                <w:szCs w:val="22"/>
+                <w:shd w:val="clear" w:color="auto" w:fill="auto"/>
+                <w:vertAlign w:val="baseline"/>
+                <w:lang w:val="vi-VN"/>
+              </w:rPr>
+              <w:t>100%</w:t>
+            </w:r>
+          </w:p>
+        </w:tc>
+        <w:tc>
+          <w:tcPr>
+            <w:tcW w:w="2083" w:type="dxa"/>
+            <w:vAlign w:val="center"/>
+          </w:tcPr>
+          <w:p>
+            <w:pPr>
+              <w:jc w:val="center"/>
+              <w:rPr>
+                <w:rFonts w:hint="default" w:ascii="Times New Roman" w:hAnsi="Times New Roman" w:cs="Times New Roman"/>
+                <w:b w:val="0"/>
+                <w:bCs w:val="0"/>
+                <w:color w:val="auto"/>
+                <w:sz w:val="22"/>
+                <w:szCs w:val="22"/>
+                <w:shd w:val="clear" w:color="auto" w:fill="auto"/>
+                <w:vertAlign w:val="baseline"/>
+                <w:lang w:val="vi-VN"/>
+              </w:rPr>
+            </w:pPr>
+            <w:r>
+              <w:rPr>
+                <w:rFonts w:hint="default" w:ascii="Times New Roman" w:hAnsi="Times New Roman" w:cs="Times New Roman"/>
+                <w:b w:val="0"/>
+                <w:bCs w:val="0"/>
+                <w:color w:val="auto"/>
+                <w:sz w:val="22"/>
+                <w:szCs w:val="22"/>
+                <w:shd w:val="clear" w:color="auto" w:fill="auto"/>
+                <w:vertAlign w:val="baseline"/>
+                <w:lang w:val="vi-VN"/>
+              </w:rPr>
+              <w:t>25%</w:t>
+            </w:r>
+          </w:p>
+        </w:tc>
+      </w:tr>
+    </w:tbl>
     <w:p>
       <w:pPr>
         <w:numPr>
+          <w:ilvl w:val="0"/>
           <w:numId w:val="0"/>
         </w:numPr>
         <w:bidi w:val="0"/>
@@ -20763,10 +21581,61 @@
           <w:rFonts w:hint="default"/>
           <w:sz w:val="25"/>
           <w:szCs w:val="25"/>
-        </w:rPr>
-      </w:pPr>
+          <w:lang w:val="vi-VN"/>
+        </w:rPr>
+      </w:pPr>
+    </w:p>
+    <w:p>
+      <w:pPr>
+        <w:numPr>
+          <w:ilvl w:val="0"/>
+          <w:numId w:val="0"/>
+        </w:numPr>
+        <w:bidi w:val="0"/>
+        <w:jc w:val="both"/>
+        <w:rPr>
+          <w:rFonts w:hint="default"/>
+          <w:sz w:val="25"/>
+          <w:szCs w:val="25"/>
+          <w:lang w:val="vi-VN"/>
+        </w:rPr>
+      </w:pPr>
+    </w:p>
+    <w:p>
+      <w:pPr>
+        <w:numPr>
+          <w:ilvl w:val="0"/>
+          <w:numId w:val="0"/>
+        </w:numPr>
+        <w:bidi w:val="0"/>
+        <w:jc w:val="center"/>
+        <w:rPr>
+          <w:rFonts w:hint="default"/>
+          <w:sz w:val="25"/>
+          <w:szCs w:val="25"/>
+          <w:lang w:val="vi-VN"/>
+        </w:rPr>
+      </w:pPr>
+      <w:r>
+        <w:rPr>
+          <w:rFonts w:hint="default"/>
+          <w:sz w:val="25"/>
+          <w:szCs w:val="25"/>
+          <w:lang w:val="vi-VN"/>
+        </w:rPr>
+        <w:t>BẢNG ĐÁNH GIÁ ĐÓNG GÓP CỦA CÁC THÀNH</w:t>
+      </w:r>
       <w:bookmarkStart w:id="64" w:name="_GoBack"/>
       <w:bookmarkEnd w:id="64"/>
+      <w:r>
+        <w:rPr>
+          <w:rFonts w:hint="default"/>
+          <w:sz w:val="25"/>
+          <w:szCs w:val="25"/>
+          <w:lang w:val="vi-VN"/>
+        </w:rPr>
+        <w:t xml:space="preserve"> VIÊN</w:t>
+      </w:r>
     </w:p>
     <w:sectPr>
       <w:footerReference r:id="rId5" w:type="default"/>
@@ -21309,7 +22178,7 @@
     <w:lsdException w:uiPriority="39" w:name="toc 8"/>
     <w:lsdException w:uiPriority="39" w:name="toc 9"/>
     <w:lsdException w:uiPriority="99" w:name="Normal Indent"/>
-    <w:lsdException w:uiPriority="99" w:name="footnote text"/>
+    <w:lsdException w:qFormat="1" w:uiPriority="99" w:name="footnote text"/>
     <w:lsdException w:uiPriority="99" w:name="annotation text"/>
     <w:lsdException w:qFormat="1" w:uiPriority="99" w:semiHidden="0" w:name="header"/>
     <w:lsdException w:qFormat="1" w:uiPriority="99" w:semiHidden="0" w:name="footer"/>
@@ -21322,7 +22191,7 @@
     <w:lsdException w:uiPriority="99" w:name="annotation reference"/>
     <w:lsdException w:uiPriority="99" w:name="line number"/>
     <w:lsdException w:uiPriority="99" w:name="page number"/>
-    <w:lsdException w:uiPriority="99" w:name="endnote reference"/>
+    <w:lsdException w:qFormat="1" w:uiPriority="99" w:name="endnote reference"/>
     <w:lsdException w:qFormat="1" w:uiPriority="99" w:name="endnote text"/>
     <w:lsdException w:uiPriority="99" w:name="table of authorities"/>
     <w:lsdException w:uiPriority="99" w:name="macro"/>
@@ -21372,7 +22241,7 @@
     <w:lsdException w:uiPriority="99" w:name="Document Map"/>
     <w:lsdException w:uiPriority="99" w:name="Plain Text"/>
     <w:lsdException w:uiPriority="99" w:name="E-mail Signature"/>
-    <w:lsdException w:uiPriority="99" w:semiHidden="0" w:name="Normal (Web)"/>
+    <w:lsdException w:qFormat="1" w:uiPriority="99" w:semiHidden="0" w:name="Normal (Web)"/>
     <w:lsdException w:uiPriority="99" w:name="HTML Acronym"/>
     <w:lsdException w:uiPriority="99" w:name="HTML Address"/>
     <w:lsdException w:uiPriority="99" w:name="HTML Cite"/>
@@ -21675,6 +22544,7 @@
     <w:name w:val="endnote reference"/>
     <w:semiHidden/>
     <w:unhideWhenUsed/>
+    <w:qFormat/>
     <w:uiPriority w:val="99"/>
     <w:rPr>
       <w:vertAlign w:val="superscript"/>
@@ -21723,6 +22593,7 @@
     <w:link w:val="22"/>
     <w:semiHidden/>
     <w:unhideWhenUsed/>
+    <w:qFormat/>
     <w:uiPriority w:val="99"/>
     <w:rPr>
       <w:rFonts w:ascii="Times New Roman" w:hAnsi="Times New Roman" w:eastAsia="Times New Roman" w:cs="Times New Roman"/>
@@ -21759,6 +22630,7 @@
     <w:name w:val="Normal (Web)"/>
     <w:basedOn w:val="1"/>
     <w:unhideWhenUsed/>
+    <w:qFormat/>
     <w:uiPriority w:val="99"/>
     <w:pPr>
       <w:spacing w:before="100" w:beforeAutospacing="1" w:after="100" w:afterAutospacing="1"/>
@@ -21858,6 +22730,7 @@
   <w:style w:type="table" w:customStyle="1" w:styleId="26">
     <w:name w:val="Grid Table Light"/>
     <w:basedOn w:val="9"/>
+    <w:qFormat/>
     <w:uiPriority w:val="40"/>
     <w:tblPr>
       <w:tblBorders>
@@ -21884,6 +22757,7 @@
   </w:style>
   <w:style w:type="paragraph" w:customStyle="1" w:styleId="28">
     <w:name w:val="WPSOffice手动目录 3"/>
+    <w:qFormat/>
     <w:uiPriority w:val="0"/>
     <w:pPr>
       <w:ind w:leftChars="400"/>

</xml_diff>